<commit_message>
Arquivos revisados apenas com o texto corrigido em amarelo, sem tachados nem notas
Co-Authored-By: Claude Opus 5.5 <noreply@anthropic.com>
Claude-Session: https://claude.ai/code/session_01HxStpW4pQoDfJdTDYr6zEC
</commit_message>
<xml_diff>
--- a/revisao_destaque_amarelo/1_INTRODUCAO_revisao.docx
+++ b/revisao_destaque_amarelo/1_INTRODUCAO_revisao.docx
@@ -25,43 +25,9 @@
       <w:r>
         <w:rPr>
           <w:rFonts w:ascii="Times New Roman" w:hAnsi="Times New Roman"/>
-          <w:b/>
-          <w:sz w:val="24"/>
-          <w:highlight w:val="yellow"/>
-        </w:rPr>
-        <w:t xml:space="preserve">[NOTA DA REVISÃO] </w:t>
-      </w:r>
-      <w:r>
-        <w:rPr>
-          <w:rFonts w:ascii="Times New Roman" w:hAnsi="Times New Roman"/>
-          <w:i/>
-          <w:sz w:val="24"/>
-          <w:highlight w:val="yellow"/>
-        </w:rPr>
-        <w:t>Legenda desta revisão: trechos em amarelo são texto novo ou reescrito; trechos em amarelo e tachados devem ser excluídos; parágrafos iniciados por [EXCLUIR] saem por inteiro; as notas como esta orientam ajustes que dependem de decisão ou conferência da autora. Arquivo gerado a partir do PDF: a formatação é aproximada e serve apenas para localizar as correções no documento original.</w:t>
-      </w:r>
-    </w:p>
-    <w:p>
-      <w:pPr>
-        <w:spacing w:line="360" w:lineRule="auto"/>
-        <w:ind w:firstLine="709"/>
-        <w:jc w:val="both"/>
-      </w:pPr>
-      <w:r>
-        <w:rPr>
-          <w:rFonts w:ascii="Times New Roman" w:hAnsi="Times New Roman"/>
           <w:sz w:val="24"/>
         </w:rPr>
         <w:t>As tecnologias digitais estão cada vez mais presentes no cotidiano escolar. Conectividade, computadores e plataformas educacionais, antes restritos aos laboratórios de informática, passaram a fazer parte do trabalho pedagógico e ampliaram as exigências dirigidas às políticas públicas. Essa presença, no entanto, não se dá da mesma forma em todas as escolas, uma vez que o uso das tecnologias depende da infraestrutura, da conexão</w:t>
-      </w:r>
-      <w:r>
-        <w:rPr>
-          <w:rFonts w:ascii="Times New Roman" w:hAnsi="Times New Roman"/>
-          <w:strike/>
-          <w:sz w:val="24"/>
-          <w:highlight w:val="yellow"/>
-        </w:rPr>
-        <w:t xml:space="preserve"> e da formação, bem como considerar o território onde</w:t>
       </w:r>
       <w:r>
         <w:rPr>
@@ -81,15 +47,6 @@
       <w:r>
         <w:rPr>
           <w:rFonts w:ascii="Times New Roman" w:hAnsi="Times New Roman"/>
-          <w:strike/>
-          <w:sz w:val="24"/>
-          <w:highlight w:val="yellow"/>
-        </w:rPr>
-        <w:t xml:space="preserve"> para contextualização</w:t>
-      </w:r>
-      <w:r>
-        <w:rPr>
-          <w:rFonts w:ascii="Times New Roman" w:hAnsi="Times New Roman"/>
           <w:sz w:val="24"/>
         </w:rPr>
         <w:t>. Ainda no fim da década de 1990, Valente (1999, p. 83) advertia que “implantar computadores nas escolas sem o devido preparo de professores e da comunidade escolar não trará os benefícios que esperamos”. A advertência continua atual, pois lembra que a chegada do equipamento não garante seu uso pedagógico. Na escola investigada, porém, a situação antecede essa discussão, uma vez que as salas de 1º e 2º anos registradas na pesquisa não dispõem de nenhum dispositivo digital. É a distância entre a educação digital garantida pela lei e as condições concretas disponíveis na sala de aula que esta tese busca compreender.</w:t>
@@ -177,15 +134,6 @@
           <w:sz w:val="24"/>
         </w:rPr>
         <w:t xml:space="preserve">Esse reconhecimento varia de pessoa para pessoa, uma vez que cultura digital e direitos digitais não são expressões autoevidentes. Quando uma professora afirma trabalhar cultura digital com a turma, ou quando uma gestora garante cuidar dos direitos digitais das crianças, cada uma fala a partir de um entendimento próprio, a ser interpretado. Stuart Hall (2006) </w:t>
-      </w:r>
-      <w:r>
-        <w:rPr>
-          <w:rFonts w:ascii="Times New Roman" w:hAnsi="Times New Roman"/>
-          <w:strike/>
-          <w:sz w:val="24"/>
-          <w:highlight w:val="yellow"/>
-        </w:rPr>
-        <w:t>ajuda na fórmula que buscamos nessas falas. Quando se discute as culturas nacionais, afirmando que: “Uma</w:t>
       </w:r>
       <w:r>
         <w:rPr>
@@ -205,15 +153,6 @@
       <w:r>
         <w:rPr>
           <w:rFonts w:ascii="Times New Roman" w:hAnsi="Times New Roman"/>
-          <w:strike/>
-          <w:sz w:val="24"/>
-          <w:highlight w:val="yellow"/>
-        </w:rPr>
-        <w:t>; o autor</w:t>
-      </w:r>
-      <w:r>
-        <w:rPr>
-          <w:rFonts w:ascii="Times New Roman" w:hAnsi="Times New Roman"/>
           <w:sz w:val="24"/>
           <w:highlight w:val="yellow"/>
         </w:rPr>
@@ -225,15 +164,6 @@
           <w:sz w:val="24"/>
         </w:rPr>
         <w:t xml:space="preserve"> não trata de políticas educacionais, e a aproximação é nossa</w:t>
-      </w:r>
-      <w:r>
-        <w:rPr>
-          <w:rFonts w:ascii="Times New Roman" w:hAnsi="Times New Roman"/>
-          <w:strike/>
-          <w:sz w:val="24"/>
-          <w:highlight w:val="yellow"/>
-        </w:rPr>
-        <w:t>. Da</w:t>
       </w:r>
       <w:r>
         <w:rPr>
@@ -263,15 +193,6 @@
           <w:sz w:val="24"/>
         </w:rPr>
         <w:t xml:space="preserve">A compreensão </w:t>
-      </w:r>
-      <w:r>
-        <w:rPr>
-          <w:rFonts w:ascii="Times New Roman" w:hAnsi="Times New Roman"/>
-          <w:strike/>
-          <w:sz w:val="24"/>
-          <w:highlight w:val="yellow"/>
-        </w:rPr>
-        <w:t>desses</w:t>
       </w:r>
       <w:r>
         <w:rPr>
@@ -291,15 +212,6 @@
       <w:r>
         <w:rPr>
           <w:rFonts w:ascii="Times New Roman" w:hAnsi="Times New Roman"/>
-          <w:strike/>
-          <w:sz w:val="24"/>
-          <w:highlight w:val="yellow"/>
-        </w:rPr>
-        <w:t>reconhecimento das narrativas que</w:t>
-      </w:r>
-      <w:r>
-        <w:rPr>
-          <w:rFonts w:ascii="Times New Roman" w:hAnsi="Times New Roman"/>
           <w:sz w:val="24"/>
           <w:highlight w:val="yellow"/>
         </w:rPr>
@@ -311,15 +223,6 @@
           <w:sz w:val="24"/>
         </w:rPr>
         <w:t xml:space="preserve"> não nascem isoladas do resto do mundo. Elas </w:t>
-      </w:r>
-      <w:r>
-        <w:rPr>
-          <w:rFonts w:ascii="Times New Roman" w:hAnsi="Times New Roman"/>
-          <w:strike/>
-          <w:sz w:val="24"/>
-          <w:highlight w:val="yellow"/>
-        </w:rPr>
-        <w:t>são respostas às</w:t>
       </w:r>
       <w:r>
         <w:rPr>
@@ -339,15 +242,6 @@
       <w:r>
         <w:rPr>
           <w:rFonts w:ascii="Times New Roman" w:hAnsi="Times New Roman"/>
-          <w:strike/>
-          <w:sz w:val="24"/>
-          <w:highlight w:val="yellow"/>
-        </w:rPr>
-        <w:t xml:space="preserve"> e Morozov (2018). A primeira com a</w:t>
-      </w:r>
-      <w:r>
-        <w:rPr>
-          <w:rFonts w:ascii="Times New Roman" w:hAnsi="Times New Roman"/>
           <w:sz w:val="24"/>
           <w:highlight w:val="yellow"/>
         </w:rPr>
@@ -359,15 +253,6 @@
           <w:sz w:val="24"/>
         </w:rPr>
         <w:t xml:space="preserve"> sua denúncia do capitalismo de vigilância</w:t>
-      </w:r>
-      <w:r>
-        <w:rPr>
-          <w:rFonts w:ascii="Times New Roman" w:hAnsi="Times New Roman"/>
-          <w:strike/>
-          <w:sz w:val="24"/>
-          <w:highlight w:val="yellow"/>
-        </w:rPr>
-        <w:t xml:space="preserve"> e o segundo com o</w:t>
       </w:r>
       <w:r>
         <w:rPr>
@@ -387,15 +272,6 @@
       <w:r>
         <w:rPr>
           <w:rFonts w:ascii="Times New Roman" w:hAnsi="Times New Roman"/>
-          <w:strike/>
-          <w:sz w:val="24"/>
-          <w:highlight w:val="yellow"/>
-        </w:rPr>
-        <w:t xml:space="preserve"> que desenham o contexto institucional que deu origem à</w:t>
-      </w:r>
-      <w:r>
-        <w:rPr>
-          <w:rFonts w:ascii="Times New Roman" w:hAnsi="Times New Roman"/>
           <w:sz w:val="24"/>
           <w:highlight w:val="yellow"/>
         </w:rPr>
@@ -407,15 +283,6 @@
           <w:sz w:val="24"/>
         </w:rPr>
         <w:t xml:space="preserve"> Política Nacional de Educação Digital (PNED)</w:t>
-      </w:r>
-      <w:r>
-        <w:rPr>
-          <w:rFonts w:ascii="Times New Roman" w:hAnsi="Times New Roman"/>
-          <w:strike/>
-          <w:sz w:val="24"/>
-          <w:highlight w:val="yellow"/>
-        </w:rPr>
-        <w:t>. Evidenciando o cenário</w:t>
       </w:r>
       <w:r>
         <w:rPr>
@@ -435,15 +302,6 @@
       <w:r>
         <w:rPr>
           <w:rFonts w:ascii="Times New Roman" w:hAnsi="Times New Roman"/>
-          <w:strike/>
-          <w:sz w:val="24"/>
-          <w:highlight w:val="yellow"/>
-        </w:rPr>
-        <w:t>imposto como uma resposta mágica</w:t>
-      </w:r>
-      <w:r>
-        <w:rPr>
-          <w:rFonts w:ascii="Times New Roman" w:hAnsi="Times New Roman"/>
           <w:sz w:val="24"/>
           <w:highlight w:val="yellow"/>
         </w:rPr>
@@ -455,15 +313,6 @@
           <w:sz w:val="24"/>
         </w:rPr>
         <w:t xml:space="preserve"> para os impasses do ensino, </w:t>
-      </w:r>
-      <w:r>
-        <w:rPr>
-          <w:rFonts w:ascii="Times New Roman" w:hAnsi="Times New Roman"/>
-          <w:strike/>
-          <w:sz w:val="24"/>
-          <w:highlight w:val="yellow"/>
-        </w:rPr>
-        <w:t>sempre sustentado por um forte setor empresarial. Não buscamos</w:t>
       </w:r>
       <w:r>
         <w:rPr>
@@ -483,15 +332,6 @@
       <w:r>
         <w:rPr>
           <w:rFonts w:ascii="Times New Roman" w:hAnsi="Times New Roman"/>
-          <w:strike/>
-          <w:sz w:val="24"/>
-          <w:highlight w:val="yellow"/>
-        </w:rPr>
-        <w:t>dos</w:t>
-      </w:r>
-      <w:r>
-        <w:rPr>
-          <w:rFonts w:ascii="Times New Roman" w:hAnsi="Times New Roman"/>
           <w:sz w:val="24"/>
           <w:highlight w:val="yellow"/>
         </w:rPr>
@@ -503,15 +343,6 @@
           <w:sz w:val="24"/>
         </w:rPr>
         <w:t xml:space="preserve"> doze profissionais de um </w:t>
-      </w:r>
-      <w:r>
-        <w:rPr>
-          <w:rFonts w:ascii="Times New Roman" w:hAnsi="Times New Roman"/>
-          <w:strike/>
-          <w:sz w:val="24"/>
-          <w:highlight w:val="yellow"/>
-        </w:rPr>
-        <w:t>municipio</w:t>
       </w:r>
       <w:r>
         <w:rPr>
@@ -531,15 +362,6 @@
       <w:r>
         <w:rPr>
           <w:rFonts w:ascii="Times New Roman" w:hAnsi="Times New Roman"/>
-          <w:strike/>
-          <w:sz w:val="24"/>
-          <w:highlight w:val="yellow"/>
-        </w:rPr>
-        <w:t>seria forçar</w:t>
-      </w:r>
-      <w:r>
-        <w:rPr>
-          <w:rFonts w:ascii="Times New Roman" w:hAnsi="Times New Roman"/>
           <w:sz w:val="24"/>
           <w:highlight w:val="yellow"/>
         </w:rPr>
@@ -551,15 +373,6 @@
           <w:sz w:val="24"/>
         </w:rPr>
         <w:t xml:space="preserve"> uma escala analítica que o material não comporta. Por essa razão, temas amplos como a plataformização do ensino e a governança de dados ajudam a situar o nascimento da política, </w:t>
-      </w:r>
-      <w:r>
-        <w:rPr>
-          <w:rFonts w:ascii="Times New Roman" w:hAnsi="Times New Roman"/>
-          <w:strike/>
-          <w:sz w:val="24"/>
-          <w:highlight w:val="yellow"/>
-        </w:rPr>
-        <w:t>e permanecem de forma intencional fora do nosso objeto empírico, reservando-se para o horizonte de</w:t>
       </w:r>
       <w:r>
         <w:rPr>
@@ -642,56 +455,6 @@
       <w:r>
         <w:rPr>
           <w:rFonts w:ascii="Times New Roman" w:hAnsi="Times New Roman"/>
-          <w:b/>
-          <w:sz w:val="24"/>
-          <w:highlight w:val="yellow"/>
-        </w:rPr>
-        <w:t xml:space="preserve">[NOTA DA REVISÃO] </w:t>
-      </w:r>
-      <w:r>
-        <w:rPr>
-          <w:rFonts w:ascii="Times New Roman" w:hAnsi="Times New Roman"/>
-          <w:i/>
-          <w:sz w:val="24"/>
-          <w:highlight w:val="yellow"/>
-        </w:rPr>
-        <w:t>O parágrafo seguinte repetia o anterior com outras palavras e foi marcado para exclusão.</w:t>
-      </w:r>
-    </w:p>
-    <w:p>
-      <w:pPr>
-        <w:spacing w:line="360" w:lineRule="auto"/>
-        <w:ind w:firstLine="709"/>
-        <w:jc w:val="both"/>
-      </w:pPr>
-      <w:r>
-        <w:rPr>
-          <w:rFonts w:ascii="Times New Roman" w:hAnsi="Times New Roman"/>
-          <w:b/>
-          <w:sz w:val="24"/>
-          <w:highlight w:val="yellow"/>
-        </w:rPr>
-        <w:t xml:space="preserve">[EXCLUIR] </w:t>
-      </w:r>
-      <w:r>
-        <w:rPr>
-          <w:rFonts w:ascii="Times New Roman" w:hAnsi="Times New Roman"/>
-          <w:strike/>
-          <w:sz w:val="24"/>
-          <w:highlight w:val="yellow"/>
-        </w:rPr>
-        <w:t>Para a proposição teórica que construímos, essa singularidade da regência é essencial. Se a profissional mobiliza recursos, tempo e conhecimentos pessoais para responder a uma carência deixada pela política pública, essa ação não se dilui em uma cadeia anônima de decisões: ela tem autoria, rosto e voz. A delimitação foi desenhada exatamente para observar o fenômeno em seu estado mais nítido, permitindo que a nossa categoria analítica seja analisada e confrontada diretamente com as narrativas de quem assume essa responsabilidade.</w:t>
-      </w:r>
-    </w:p>
-    <w:p>
-      <w:pPr>
-        <w:spacing w:line="360" w:lineRule="auto"/>
-        <w:ind w:firstLine="709"/>
-        <w:jc w:val="both"/>
-      </w:pPr>
-      <w:r>
-        <w:rPr>
-          <w:rFonts w:ascii="Times New Roman" w:hAnsi="Times New Roman"/>
           <w:sz w:val="24"/>
         </w:rPr>
         <w:t>Nesses dois anos situa-se também o ciclo de alfabetização, cujo lugar nesta tese precisa ser esclarecido. Acompanhamos esse momento da escolarização desde o mestrado, mas a aprendizagem da escrita e o desenvolvimento infantil não constituem objeto desta investigação. O interesse pela etapa decorre por ser a entrada da criança no Ensino Fundamental, momento em que a escola passa a ter a tarefa de compreender as experiências digitais construídas pelas crianças fora de seus muros.</w:t>
@@ -709,15 +472,6 @@
           <w:sz w:val="24"/>
         </w:rPr>
         <w:t xml:space="preserve">Essas experiências costumam ser lidas a partir da ideia, bastante difundida, </w:t>
-      </w:r>
-      <w:r>
-        <w:rPr>
-          <w:rFonts w:ascii="Times New Roman" w:hAnsi="Times New Roman"/>
-          <w:strike/>
-          <w:sz w:val="24"/>
-          <w:highlight w:val="yellow"/>
-        </w:rPr>
-        <w:t>os nativos digitais, de uma facilidade natural das novas gerações</w:t>
       </w:r>
       <w:r>
         <w:rPr>
@@ -737,15 +491,6 @@
       <w:r>
         <w:rPr>
           <w:rFonts w:ascii="Times New Roman" w:hAnsi="Times New Roman"/>
-          <w:strike/>
-          <w:sz w:val="24"/>
-          <w:highlight w:val="yellow"/>
-        </w:rPr>
-        <w:t>, porém diretamente</w:t>
-      </w:r>
-      <w:r>
-        <w:rPr>
-          <w:rFonts w:ascii="Times New Roman" w:hAnsi="Times New Roman"/>
           <w:sz w:val="24"/>
           <w:highlight w:val="yellow"/>
         </w:rPr>
@@ -771,15 +516,6 @@
           <w:sz w:val="24"/>
         </w:rPr>
         <w:t xml:space="preserve">Em Pipa, além disso, as crianças chegam à escola com experiências digitais muito desiguais, marcadas pela trajetória e pelas possibilidades de suas famílias e pelo próprio território. Diante dessa diversidade e sem o apoio anunciado pela política, supomos que </w:t>
-      </w:r>
-      <w:r>
-        <w:rPr>
-          <w:rFonts w:ascii="Times New Roman" w:hAnsi="Times New Roman"/>
-          <w:strike/>
-          <w:sz w:val="24"/>
-          <w:highlight w:val="yellow"/>
-        </w:rPr>
-        <w:t>o profissional</w:t>
       </w:r>
       <w:r>
         <w:rPr>
@@ -799,15 +535,6 @@
       <w:r>
         <w:rPr>
           <w:rFonts w:ascii="Times New Roman" w:hAnsi="Times New Roman"/>
-          <w:strike/>
-          <w:sz w:val="24"/>
-          <w:highlight w:val="yellow"/>
-        </w:rPr>
-        <w:t>que se</w:t>
-      </w:r>
-      <w:r>
-        <w:rPr>
-          <w:rFonts w:ascii="Times New Roman" w:hAnsi="Times New Roman"/>
           <w:sz w:val="24"/>
           <w:highlight w:val="yellow"/>
         </w:rPr>
@@ -874,15 +601,6 @@
           <w:sz w:val="24"/>
         </w:rPr>
         <w:t xml:space="preserve">A relevância deste objeto está, antes de tudo, no que o eixo promete às crianças. O inciso III do art. 3º associa a cultura digital à “participação consciente e democrática por meio das tecnologias digitais”, e o inciso IV associa os direitos digitais à “proteção dos dados da população mais vulnerável, em especial crianças e adolescentes” (BRASIL, 2023a, art. 3º, III e IV). Com a derrubada do veto ao § 11 do art. 26 da Lei de Diretrizes e Bases da Educação Nacional (LDB), a educação digital passou a ser componente curricular do ensino fundamental (BRASIL, 1996, art. 26, § 11), e a proteção da infância no ambiente digital ganhou outro marco com o Estatuto Digital da Criança e do Adolescente (BRASIL, 2025c), em vigor desde março de 2026. O componente </w:t>
-      </w:r>
-      <w:r>
-        <w:rPr>
-          <w:rFonts w:ascii="Times New Roman" w:hAnsi="Times New Roman"/>
-          <w:strike/>
-          <w:sz w:val="24"/>
-          <w:highlight w:val="yellow"/>
-        </w:rPr>
-        <w:t>curricular pode ser</w:t>
       </w:r>
       <w:r>
         <w:rPr>
@@ -902,15 +620,6 @@
       <w:r>
         <w:rPr>
           <w:rFonts w:ascii="Times New Roman" w:hAnsi="Times New Roman"/>
-          <w:strike/>
-          <w:sz w:val="24"/>
-          <w:highlight w:val="yellow"/>
-        </w:rPr>
-        <w:t>um componente curricular</w:t>
-      </w:r>
-      <w:r>
-        <w:rPr>
-          <w:rFonts w:ascii="Times New Roman" w:hAnsi="Times New Roman"/>
           <w:sz w:val="24"/>
           <w:highlight w:val="yellow"/>
         </w:rPr>
@@ -982,15 +691,6 @@
       <w:r>
         <w:rPr>
           <w:rFonts w:ascii="Times New Roman" w:hAnsi="Times New Roman"/>
-          <w:strike/>
-          <w:sz w:val="24"/>
-          <w:highlight w:val="yellow"/>
-        </w:rPr>
-        <w:t>vai reencontrar fora da escola.</w:t>
-      </w:r>
-      <w:r>
-        <w:rPr>
-          <w:rFonts w:ascii="Times New Roman" w:hAnsi="Times New Roman"/>
           <w:sz w:val="24"/>
           <w:highlight w:val="yellow"/>
         </w:rPr>
@@ -1020,56 +720,6 @@
       <w:r>
         <w:rPr>
           <w:rFonts w:ascii="Times New Roman" w:hAnsi="Times New Roman"/>
-          <w:b/>
-          <w:sz w:val="24"/>
-          <w:highlight w:val="yellow"/>
-        </w:rPr>
-        <w:t xml:space="preserve">[NOTA DA REVISÃO] </w:t>
-      </w:r>
-      <w:r>
-        <w:rPr>
-          <w:rFonts w:ascii="Times New Roman" w:hAnsi="Times New Roman"/>
-          <w:i/>
-          <w:sz w:val="24"/>
-          <w:highlight w:val="yellow"/>
-        </w:rPr>
-        <w:t>O parágrafo seguinte repetia o anterior (“a categoria mais ampla não apaga as diferenças”) e foi marcado para exclusão.</w:t>
-      </w:r>
-    </w:p>
-    <w:p>
-      <w:pPr>
-        <w:spacing w:line="360" w:lineRule="auto"/>
-        <w:ind w:firstLine="709"/>
-        <w:jc w:val="both"/>
-      </w:pPr>
-      <w:r>
-        <w:rPr>
-          <w:rFonts w:ascii="Times New Roman" w:hAnsi="Times New Roman"/>
-          <w:b/>
-          <w:sz w:val="24"/>
-          <w:highlight w:val="yellow"/>
-        </w:rPr>
-        <w:t xml:space="preserve">[EXCLUIR] </w:t>
-      </w:r>
-      <w:r>
-        <w:rPr>
-          <w:rFonts w:ascii="Times New Roman" w:hAnsi="Times New Roman"/>
-          <w:strike/>
-          <w:sz w:val="24"/>
-          <w:highlight w:val="yellow"/>
-        </w:rPr>
-        <w:t>É importante destacar que a categoria mais ampla não apaga as diferenças. Quem está na regência de sala, na coordenação, na direção ou na Secretaria recebe a política de uma forma diferente, no que se refere à margem de decisão, acesso a recursos e responsabilidades próprias. Dessa maneira, a mesma orientação da PNED ganha sentidos e gera demandas diferentes em cada posição.</w:t>
-      </w:r>
-    </w:p>
-    <w:p>
-      <w:pPr>
-        <w:spacing w:line="360" w:lineRule="auto"/>
-        <w:ind w:firstLine="709"/>
-        <w:jc w:val="both"/>
-      </w:pPr>
-      <w:r>
-        <w:rPr>
-          <w:rFonts w:ascii="Times New Roman" w:hAnsi="Times New Roman"/>
           <w:sz w:val="24"/>
         </w:rPr>
         <w:t>A delimitação do campo em Pipa acrescenta à pesquisa condições próprias do território. O distrito integra um município de pequeno porte, mas apresenta turismo intenso e relações econômicas, sociais e culturais para além dos limites locais. Para compreendê-lo, recorremos a Milton Santos (1999), para quem “o território não é uma categoria de análise, a categoria de análise é o território usado” (SANTOS, 1999, p. 18). O território usado, explica o autor, deve ser visto “como um campo de forças, como o lugar do exercício, de dialéticas e contradições entre o vertical e o horizontal, entre o Estado e o mercado, entre o uso econômico e o uso social dos recursos” (SANTOS, 1999, p. 19). Em Pipa, essa contradição tem expressão concreta, pois a conectividade de que dependem os circuitos turísticos convive, no mesmo distrito, com uma escola pública de poucos recursos digitais.</w:t>
@@ -1115,15 +765,6 @@
           <w:sz w:val="24"/>
         </w:rPr>
         <w:t xml:space="preserve">Castells (2013) e Bauman (1999) discutem a aceleração das transformações da cultura contemporânea. Desse debate, interessa-nos o que diz respeito à escola: novas demandas ligadas às tecnologias e à cultura digital chegam com rapidez, enquanto a jornada, os momentos de planejamento e os horários seguem uma organização definida antes delas. O problema está, então, no tempo de que os profissionais dispõem para incorporar essas exigências a uma rotina já estabelecida. </w:t>
-      </w:r>
-      <w:r>
-        <w:rPr>
-          <w:rFonts w:ascii="Times New Roman" w:hAnsi="Times New Roman"/>
-          <w:strike/>
-          <w:sz w:val="24"/>
-          <w:highlight w:val="yellow"/>
-        </w:rPr>
-        <w:t>Queiroz e Paiva (2014, p. 253) lembram que os profissionais da escola “exercem várias funções”, da gestão à docência, ao planejamento e à avaliação, e que o trabalho docente se estende à casa, “quando planeja as aulas, corrige trabalhos, preenche cadernetas” (p. 255).</w:t>
       </w:r>
       <w:r>
         <w:rPr>
@@ -1146,15 +787,6 @@
           <w:sz w:val="24"/>
         </w:rPr>
         <w:t xml:space="preserve">A posição da pesquisadora também integra esse quadro. Freire (2019, p. 96) afirma: “Neutra, ‘indiferente’ a qualquer destas hipóteses, a da reprodução da ideologia dominante ou a de sua contestação, a educação jamais foi, é, ou pode ser”. Esta pesquisa, dedicada à educação, assume a mesma condição e não se pretende </w:t>
-      </w:r>
-      <w:r>
-        <w:rPr>
-          <w:rFonts w:ascii="Times New Roman" w:hAnsi="Times New Roman"/>
-          <w:strike/>
-          <w:sz w:val="24"/>
-          <w:highlight w:val="yellow"/>
-        </w:rPr>
-        <w:t>neutralidade</w:t>
       </w:r>
       <w:r>
         <w:rPr>
@@ -1272,15 +904,6 @@
       <w:r>
         <w:rPr>
           <w:rFonts w:ascii="Times New Roman" w:hAnsi="Times New Roman"/>
-          <w:strike/>
-          <w:sz w:val="24"/>
-          <w:highlight w:val="yellow"/>
-        </w:rPr>
-        <w:t>onde</w:t>
-      </w:r>
-      <w:r>
-        <w:rPr>
-          <w:rFonts w:ascii="Times New Roman" w:hAnsi="Times New Roman"/>
           <w:sz w:val="24"/>
           <w:highlight w:val="yellow"/>
         </w:rPr>
@@ -1292,15 +915,6 @@
           <w:sz w:val="24"/>
         </w:rPr>
         <w:t xml:space="preserve"> a pesquisa se desenvolve. A situação poderia ser tratada como simples falha de gestão local. Recusamos essa leitura, pois ela retira de cena o desenho da lei e invisibiliza o trabalho realizado cotidianamente pelos profissionais diante das lacunas da política. Ball (2011, p. 36) descreve esse deslocamento ao criticar pesquisas presas a “táticas de formuladores de políticas não reflexivas, ‘baseadas na culpabilização’, nas quais as políticas são sempre soluções e nunca parte do problema. O problema está ‘na’ escola ou ‘no’ professor, mas ‘nunca nas políticas’”. O autor esclarece, na mesma página: “Não estou pretendendo ‘desculpar a má prática’” (BALL, 2011, p. 36). Esta pesquisa assume a mesma cautela. </w:t>
-      </w:r>
-      <w:r>
-        <w:rPr>
-          <w:rFonts w:ascii="Times New Roman" w:hAnsi="Times New Roman"/>
-          <w:strike/>
-          <w:sz w:val="24"/>
-          <w:highlight w:val="yellow"/>
-        </w:rPr>
-        <w:t>A análise no</w:t>
       </w:r>
       <w:r>
         <w:rPr>
@@ -1334,15 +948,6 @@
       <w:r>
         <w:rPr>
           <w:rFonts w:ascii="Times New Roman" w:hAnsi="Times New Roman"/>
-          <w:strike/>
-          <w:sz w:val="24"/>
-          <w:highlight w:val="yellow"/>
-        </w:rPr>
-        <w:t>na dimensão dessa</w:t>
-      </w:r>
-      <w:r>
-        <w:rPr>
-          <w:rFonts w:ascii="Times New Roman" w:hAnsi="Times New Roman"/>
           <w:sz w:val="24"/>
           <w:highlight w:val="yellow"/>
         </w:rPr>
@@ -1368,15 +973,6 @@
           <w:sz w:val="24"/>
         </w:rPr>
         <w:t xml:space="preserve">O problema ganha, ainda, uma dimensão temporal com a Resolução CNE/CEB nº 2/2025, segundo a qual os novos currículos, acompanhados de plano de formação docente, deveriam ser elaborados ao longo de 2025, com implementação obrigatória a partir de 2026, admitida, nos anos iniciais do Ensino Fundamental, a adoção concomitante dessas medidas (BRASIL, 2025a, art. 36). A PNED, instituída em 2023, chega assim ao momento em que suas orientações incidem sobre a organização curricular das escolas. A investigação acontece nesse momento, quando o escrito na norma encontra </w:t>
-      </w:r>
-      <w:r>
-        <w:rPr>
-          <w:rFonts w:ascii="Times New Roman" w:hAnsi="Times New Roman"/>
-          <w:strike/>
-          <w:sz w:val="24"/>
-          <w:highlight w:val="yellow"/>
-        </w:rPr>
-        <w:t>territorio</w:t>
       </w:r>
       <w:r>
         <w:rPr>
@@ -1410,15 +1006,6 @@
       <w:r>
         <w:rPr>
           <w:rFonts w:ascii="Times New Roman" w:hAnsi="Times New Roman"/>
-          <w:strike/>
-          <w:sz w:val="24"/>
-          <w:highlight w:val="yellow"/>
-        </w:rPr>
-        <w:t xml:space="preserve">Novas demandas ligadas às tecnologias chegam com rapidez, enquanto a jornada, os momentos de planejamento e os horários seguem uma organização definida antes delas. </w:t>
-      </w:r>
-      <w:r>
-        <w:rPr>
-          <w:rFonts w:ascii="Times New Roman" w:hAnsi="Times New Roman"/>
           <w:sz w:val="24"/>
         </w:rPr>
         <w:t>A relação entre a velocidade das transformações da cultura contemporânea e o tempo escolar recebe tratamento teórico no Capítulo 3; nesta introdução, interessa-nos o tempo concreto do trabalho.</w:t>
@@ -1440,27 +1027,9 @@
       <w:r>
         <w:rPr>
           <w:rFonts w:ascii="Times New Roman" w:hAnsi="Times New Roman"/>
-          <w:strike/>
-          <w:sz w:val="24"/>
-          <w:highlight w:val="yellow"/>
-        </w:rPr>
-        <w:t>, p. 253</w:t>
-      </w:r>
-      <w:r>
-        <w:rPr>
-          <w:rFonts w:ascii="Times New Roman" w:hAnsi="Times New Roman"/>
           <w:sz w:val="24"/>
         </w:rPr>
         <w:t xml:space="preserve">) lembram que os profissionais da escola </w:t>
-      </w:r>
-      <w:r>
-        <w:rPr>
-          <w:rFonts w:ascii="Times New Roman" w:hAnsi="Times New Roman"/>
-          <w:strike/>
-          <w:sz w:val="24"/>
-          <w:highlight w:val="yellow"/>
-        </w:rPr>
-        <w:t>“exercem várias funções”</w:t>
       </w:r>
       <w:r>
         <w:rPr>
@@ -1495,15 +1064,6 @@
       <w:r>
         <w:rPr>
           <w:rFonts w:ascii="Times New Roman" w:hAnsi="Times New Roman"/>
-          <w:strike/>
-          <w:sz w:val="24"/>
-          <w:highlight w:val="yellow"/>
-        </w:rPr>
-        <w:t xml:space="preserve">Mais de oito em cada dez profissionais, portanto, já levavam a escola para casa. </w:t>
-      </w:r>
-      <w:r>
-        <w:rPr>
-          <w:rFonts w:ascii="Times New Roman" w:hAnsi="Times New Roman"/>
           <w:sz w:val="24"/>
         </w:rPr>
         <w:t>O dado pertence àquele período e antecede a PNED; porém, serve para situar o cenário no qual novas tarefas chegam à escola, sem medir a situação atual.</w:t>
@@ -1521,15 +1081,6 @@
           <w:sz w:val="24"/>
         </w:rPr>
         <w:t xml:space="preserve">A situação tampouco é exclusiva </w:t>
-      </w:r>
-      <w:r>
-        <w:rPr>
-          <w:rFonts w:ascii="Times New Roman" w:hAnsi="Times New Roman"/>
-          <w:strike/>
-          <w:sz w:val="24"/>
-          <w:highlight w:val="yellow"/>
-        </w:rPr>
-        <w:t>e situada apenas no</w:t>
       </w:r>
       <w:r>
         <w:rPr>
@@ -1578,15 +1129,6 @@
       <w:r>
         <w:rPr>
           <w:rFonts w:ascii="Times New Roman" w:hAnsi="Times New Roman"/>
-          <w:strike/>
-          <w:sz w:val="24"/>
-          <w:highlight w:val="yellow"/>
-        </w:rPr>
-        <w:t>mesmo a lei sendo criada em</w:t>
-      </w:r>
-      <w:r>
-        <w:rPr>
-          <w:rFonts w:ascii="Times New Roman" w:hAnsi="Times New Roman"/>
           <w:sz w:val="24"/>
           <w:highlight w:val="yellow"/>
         </w:rPr>
@@ -1612,15 +1154,6 @@
           <w:sz w:val="24"/>
         </w:rPr>
         <w:t xml:space="preserve">O desenho da lei, </w:t>
-      </w:r>
-      <w:r>
-        <w:rPr>
-          <w:rFonts w:ascii="Times New Roman" w:hAnsi="Times New Roman"/>
-          <w:strike/>
-          <w:sz w:val="24"/>
-          <w:highlight w:val="yellow"/>
-        </w:rPr>
-        <w:t>capacidade da rede, tempo de trabalho,</w:t>
       </w:r>
       <w:r>
         <w:rPr>
@@ -1845,15 +1378,6 @@
           <w:sz w:val="24"/>
         </w:rPr>
         <w:t xml:space="preserve">Lipsky (2019) construiu sua teoria observando serviços </w:t>
-      </w:r>
-      <w:r>
-        <w:rPr>
-          <w:rFonts w:ascii="Times New Roman" w:hAnsi="Times New Roman"/>
-          <w:strike/>
-          <w:sz w:val="24"/>
-          <w:highlight w:val="yellow"/>
-        </w:rPr>
-        <w:t>nos quais “o processamento em massa de clientes é a norma” (LIPSKY, 2019, p. 16) e nos quais</w:t>
       </w:r>
       <w:r>
         <w:rPr>
@@ -1888,15 +1412,6 @@
       <w:r>
         <w:rPr>
           <w:rFonts w:ascii="Times New Roman" w:hAnsi="Times New Roman"/>
-          <w:strike/>
-          <w:sz w:val="24"/>
-          <w:highlight w:val="yellow"/>
-        </w:rPr>
-        <w:t>ou seja</w:t>
-      </w:r>
-      <w:r>
-        <w:rPr>
-          <w:rFonts w:ascii="Times New Roman" w:hAnsi="Times New Roman"/>
           <w:sz w:val="24"/>
           <w:highlight w:val="yellow"/>
         </w:rPr>
@@ -1908,15 +1423,6 @@
           <w:sz w:val="24"/>
         </w:rPr>
         <w:t>, não há o que racionar. A questão, nesse caso, antecede o racionamento: que margem de ação resta à profissional quando falta aquilo de que a política depende para acontecer na sala de aula? A escala também é outra</w:t>
-      </w:r>
-      <w:r>
-        <w:rPr>
-          <w:rFonts w:ascii="Times New Roman" w:hAnsi="Times New Roman"/>
-          <w:strike/>
-          <w:sz w:val="24"/>
-          <w:highlight w:val="yellow"/>
-        </w:rPr>
-        <w:t>. Em uma escola pequena de Pipa, a profissional conhece cada criança e cada família e, com frequência, vive no mesmo território. Adiar uma atividade tem, nesse contexto, custo social imediato e constitui uma decisão tomada diante de pessoas que ele reencontrará fora da escola</w:t>
       </w:r>
       <w:r>
         <w:rPr>
@@ -2030,15 +1536,6 @@
           <w:sz w:val="24"/>
         </w:rPr>
         <w:t>É desse descompasso que nasce a proposição desta tese, a “discricionariedade substitutiva</w:t>
-      </w:r>
-      <w:r>
-        <w:rPr>
-          <w:rFonts w:ascii="Times New Roman" w:hAnsi="Times New Roman"/>
-          <w:strike/>
-          <w:sz w:val="24"/>
-          <w:highlight w:val="yellow"/>
-        </w:rPr>
-        <w:t>"</w:t>
       </w:r>
       <w:r>
         <w:rPr>
@@ -2058,15 +1555,6 @@
       <w:r>
         <w:rPr>
           <w:rFonts w:ascii="Times New Roman" w:hAnsi="Times New Roman"/>
-          <w:strike/>
-          <w:sz w:val="24"/>
-          <w:highlight w:val="yellow"/>
-        </w:rPr>
-        <w:t>Trata-se da principal contribuição da tese para a</w:t>
-      </w:r>
-      <w:r>
-        <w:rPr>
-          <w:rFonts w:ascii="Times New Roman" w:hAnsi="Times New Roman"/>
           <w:sz w:val="24"/>
           <w:highlight w:val="yellow"/>
         </w:rPr>
@@ -2106,15 +1594,6 @@
           <w:sz w:val="24"/>
         </w:rPr>
         <w:t xml:space="preserve">A ausência atinge também o conhecimento esperado dos profissionais, além de equipamentos e conexão. A lei inclui entre as estratégias do eixo a formação inicial de professores em competências digitais e a presença das tecnologias nos cursos de formação continuada (BRASIL, 2023a, art. 3º, § 1º, IX e X), mas como ações de promoção, sem definir responsáveis, prazos, carga horária ou fontes de custeio. A Resolução CNE/CEB nº 2/2025 só veio em 2025, mais de dois anos depois da PNED, e atribuiu aos sistemas de ensino e às instituições a definição e a implementação de estratégias de formação continuada para a educação digital e midiática (BRASIL, 2025a, art. 37). Se os registros da SME e o questionário confirmarem a chegada recente da formação à rede investigada, os profissionais terão passado esse intervalo responsáveis por um componente curricular sem a formação prevista. </w:t>
-      </w:r>
-      <w:r>
-        <w:rPr>
-          <w:rFonts w:ascii="Times New Roman" w:hAnsi="Times New Roman"/>
-          <w:strike/>
-          <w:sz w:val="24"/>
-          <w:highlight w:val="yellow"/>
-        </w:rPr>
-        <w:t>É preciso o entendimento do que foi de fato suprido por essa formação, caso não tenha como ponto de partida as reais necessidades dos profissionais, também será considerada como inexistente, pois os mesmo precisam suprir</w:t>
       </w:r>
       <w:r>
         <w:rPr>
@@ -2134,15 +1613,6 @@
       <w:r>
         <w:rPr>
           <w:rFonts w:ascii="Times New Roman" w:hAnsi="Times New Roman"/>
-          <w:strike/>
-          <w:sz w:val="24"/>
-          <w:highlight w:val="yellow"/>
-        </w:rPr>
-        <w:t xml:space="preserve"> essa lacuna</w:t>
-      </w:r>
-      <w:r>
-        <w:rPr>
-          <w:rFonts w:ascii="Times New Roman" w:hAnsi="Times New Roman"/>
           <w:sz w:val="24"/>
           <w:highlight w:val="yellow"/>
         </w:rPr>
@@ -2179,31 +1649,6 @@
       <w:r>
         <w:rPr>
           <w:rFonts w:ascii="Times New Roman" w:hAnsi="Times New Roman"/>
-          <w:b/>
-          <w:sz w:val="24"/>
-          <w:highlight w:val="yellow"/>
-        </w:rPr>
-        <w:t xml:space="preserve">[NOTA DA REVISÃO] </w:t>
-      </w:r>
-      <w:r>
-        <w:rPr>
-          <w:rFonts w:ascii="Times New Roman" w:hAnsi="Times New Roman"/>
-          <w:i/>
-          <w:sz w:val="24"/>
-          <w:highlight w:val="yellow"/>
-        </w:rPr>
-        <w:t>Castells (2003) é citado com páginas 8 e 212, mas a lista de referências traz apenas Castells (2013), A sociedade em rede. Incluir a obra de 2003 na lista.</w:t>
-      </w:r>
-    </w:p>
-    <w:p>
-      <w:pPr>
-        <w:spacing w:line="360" w:lineRule="auto"/>
-        <w:ind w:firstLine="709"/>
-        <w:jc w:val="both"/>
-      </w:pPr>
-      <w:r>
-        <w:rPr>
-          <w:rFonts w:ascii="Times New Roman" w:hAnsi="Times New Roman"/>
           <w:sz w:val="24"/>
         </w:rPr>
         <w:t>Das duas saídas, aprender sozinho corresponde a um dos componentes da categoria, enquanto ensinar apenas o que já domina só conta quando o relato associa essa restrição à falta de formação, uma vez que ela também pode resultar de escolha pedagógica. A simples existência de formação, por sua vez, não afasta a ausência. Valente (1999, p. 113) lembra: “Embora a formação do professor seja um dos fatores importantes dessa mudança, ela não pode ser vista como o único fator desencadeador de mudança da escola”. Pelos critérios metodológicos que sustentarão a categoria analítica, apresentados no Capítulo 4, a formação deixa de ser condição ausente apenas quando chegou antes da exigência, alcançou a profissional na função e na etapa em que atua e tratou dos conteúdos que ela precisou buscar sozinha. Se o profissional relatar a insuficiência de uma formação com essas características para o trabalho com a turma, o relato é registrado e comparado com os registros de formação. A formação não constitui objeto próprio desta investigação, pois examinamos as condições oferecidas pela política e a correspondência entre o oferecido e o exigido, sem avaliar o saber dos profissionais.</w:t>
@@ -2235,31 +1680,6 @@
           <w:sz w:val="24"/>
         </w:rPr>
         <w:t>Esses riscos nascem de um desenho no qual se transfere aos profissionais uma tarefa sem os meios correspondentes e, por isso, não podem ser tratados como falha individual. Freire (2019, p. 64-65) lembra: “O professor tem o dever de dar suas aulas, de realizar sua tarefa docente. Para isso, precisa de condições favoráveis, higiênicas, espaciais, estéticas, sem as quais se move menos eficazmente no espaço pedagógico. Às vezes, as condições são de tal maneira perversas que nem se move”. Bauman, em escala mais ampla, descreve a mesma inversão ao afirmar: “Riscos e contradições continuam a ser socialmente produzidos; são apenas o dever e a necessidade de enfrentá-los que estão sendo individualizados” (BAUMAN, 2001). Nenhum dos dois autores trata da PNED; a relação com o caso é construída por esta tese. Quando um profissional retira do próprio tempo e dos próprios recursos o que a política prometeu, tratamos isso como custo, e esse custo atinge também a turma, que passa a receber menos do que a lei assegura sem uma decisão explícita de alguém nesse sentido. Por enquanto, esses efeitos são riscos, e o campo mostrará quais deles se confirmam.</w:t>
-      </w:r>
-    </w:p>
-    <w:p>
-      <w:pPr>
-        <w:spacing w:line="360" w:lineRule="auto"/>
-        <w:ind w:firstLine="709"/>
-        <w:jc w:val="both"/>
-      </w:pPr>
-      <w:r>
-        <w:rPr>
-          <w:rFonts w:ascii="Times New Roman" w:hAnsi="Times New Roman"/>
-          <w:b/>
-          <w:sz w:val="24"/>
-          <w:highlight w:val="yellow"/>
-        </w:rPr>
-        <w:t xml:space="preserve">[NOTA DA REVISÃO] </w:t>
-      </w:r>
-      <w:r>
-        <w:rPr>
-          <w:rFonts w:ascii="Times New Roman" w:hAnsi="Times New Roman"/>
-          <w:i/>
-          <w:sz w:val="24"/>
-          <w:highlight w:val="yellow"/>
-        </w:rPr>
-        <w:t>A citação de Bauman (2001) é direta e está sem página. Indicar a página e incluir a obra na lista de referências (provavelmente Modernidade líquida; conferir).</w:t>
       </w:r>
     </w:p>
     <w:p>
@@ -2481,15 +1901,6 @@
       <w:r>
         <w:rPr>
           <w:rFonts w:ascii="Times New Roman" w:hAnsi="Times New Roman"/>
-          <w:strike/>
-          <w:sz w:val="24"/>
-          <w:highlight w:val="yellow"/>
-        </w:rPr>
-        <w:t>Diante do exposto, sustentamos</w:t>
-      </w:r>
-      <w:r>
-        <w:rPr>
-          <w:rFonts w:ascii="Times New Roman" w:hAnsi="Times New Roman"/>
           <w:sz w:val="24"/>
           <w:highlight w:val="yellow"/>
         </w:rPr>
@@ -2691,31 +2102,6 @@
     </w:p>
     <w:p>
       <w:pPr>
-        <w:spacing w:line="360" w:lineRule="auto"/>
-        <w:ind w:firstLine="709"/>
-        <w:jc w:val="both"/>
-      </w:pPr>
-      <w:r>
-        <w:rPr>
-          <w:rFonts w:ascii="Times New Roman" w:hAnsi="Times New Roman"/>
-          <w:b/>
-          <w:sz w:val="24"/>
-          <w:highlight w:val="yellow"/>
-        </w:rPr>
-        <w:t xml:space="preserve">[NOTA DA REVISÃO] </w:t>
-      </w:r>
-      <w:r>
-        <w:rPr>
-          <w:rFonts w:ascii="Times New Roman" w:hAnsi="Times New Roman"/>
-          <w:i/>
-          <w:sz w:val="24"/>
-          <w:highlight w:val="yellow"/>
-        </w:rPr>
-        <w:t>Buckingham é citado no texto como 2006 e aqui consta como 2007 (Loyola); no Capítulo 2 aparece como 2006 (Florianópolis, [s. n.]). Unificar a edição.</w:t>
-      </w:r>
-    </w:p>
-    <w:p>
-      <w:pPr>
         <w:spacing w:line="240" w:lineRule="auto" w:after="240"/>
         <w:jc w:val="left"/>
       </w:pPr>
@@ -2751,15 +2137,6 @@
           <w:sz w:val="24"/>
         </w:rPr>
         <w:t xml:space="preserve">FREIRE, Paulo. Pedagogia da autonomia: saberes necessários à prática educativa. </w:t>
-      </w:r>
-      <w:r>
-        <w:rPr>
-          <w:rFonts w:ascii="Times New Roman" w:hAnsi="Times New Roman"/>
-          <w:strike/>
-          <w:sz w:val="24"/>
-          <w:highlight w:val="yellow"/>
-        </w:rPr>
-        <w:t>São Paulo: Paz e Terra, 1996</w:t>
       </w:r>
       <w:r>
         <w:rPr>
@@ -2965,31 +2342,6 @@
     </w:p>
     <w:p>
       <w:pPr>
-        <w:spacing w:line="360" w:lineRule="auto"/>
-        <w:ind w:firstLine="709"/>
-        <w:jc w:val="both"/>
-      </w:pPr>
-      <w:r>
-        <w:rPr>
-          <w:rFonts w:ascii="Times New Roman" w:hAnsi="Times New Roman"/>
-          <w:b/>
-          <w:sz w:val="24"/>
-          <w:highlight w:val="yellow"/>
-        </w:rPr>
-        <w:t xml:space="preserve">[NOTA DA REVISÃO] </w:t>
-      </w:r>
-      <w:r>
-        <w:rPr>
-          <w:rFonts w:ascii="Times New Roman" w:hAnsi="Times New Roman"/>
-          <w:i/>
-          <w:sz w:val="24"/>
-          <w:highlight w:val="yellow"/>
-        </w:rPr>
-        <w:t>A obra de Santos de 2006 (A natureza do espaço) não é citada na Introdução; as citadas são 1999 e 2012, acrescentadas acima com os dados que constam nos Capítulos 4 e 6. Também não são citados na Introdução: BALL (2004), KITCHENHAM e CHARTERS (2007), OKOLI (2019), THOMAS e HARDEN (2008) e ANDRÉ (2005); verificar se devem permanecer na lista.</w:t>
-      </w:r>
-    </w:p>
-    <w:p>
-      <w:pPr>
         <w:spacing w:line="240" w:lineRule="auto" w:after="240"/>
         <w:jc w:val="left"/>
       </w:pPr>
@@ -3025,31 +2377,6 @@
           <w:sz w:val="24"/>
         </w:rPr>
         <w:t>VALENTE, José Armando. O computador na sociedade do conhecimento. 3. ed. Campinas: NIED/Unicamp, 2019.</w:t>
-      </w:r>
-    </w:p>
-    <w:p>
-      <w:pPr>
-        <w:spacing w:line="360" w:lineRule="auto"/>
-        <w:ind w:firstLine="709"/>
-        <w:jc w:val="both"/>
-      </w:pPr>
-      <w:r>
-        <w:rPr>
-          <w:rFonts w:ascii="Times New Roman" w:hAnsi="Times New Roman"/>
-          <w:b/>
-          <w:sz w:val="24"/>
-          <w:highlight w:val="yellow"/>
-        </w:rPr>
-        <w:t xml:space="preserve">[NOTA DA REVISÃO] </w:t>
-      </w:r>
-      <w:r>
-        <w:rPr>
-          <w:rFonts w:ascii="Times New Roman" w:hAnsi="Times New Roman"/>
-          <w:i/>
-          <w:sz w:val="24"/>
-          <w:highlight w:val="yellow"/>
-        </w:rPr>
-        <w:t>Valente é citado como 1999 no texto (aqui e no Capítulo 6), mas a referência traz 3. ed., 2019. Unificar: se a edição consultada for a de 2019, ajustar todas as chamadas para 2019; se for a de 1999, ajustar a referência.</w:t>
       </w:r>
     </w:p>
     <w:p>

</xml_diff>